<commit_message>
Change Likert scale from 7-point to 5-point across manuscript files
</commit_message>
<xml_diff>
--- a/Survey_Instrument_and_Data_Dictionary.docx
+++ b/Survey_Instrument_and_Data_Dictionary.docx
@@ -33,7 +33,7 @@
           <w:rFonts w:ascii="Times New Roman" w:hAnsi="Times New Roman"/>
           <w:sz w:val="22"/>
         </w:rPr>
-        <w:t>All construct items use a 7-point Likert scale: 1 = strongly disagree, 2 = disagree, 3 = somewhat disagree, 4 = neutral, 5 = somewhat agree, 6 = agree, 7 = strongly agree. The brand named in S5 is piped into every item in place of “this brand.” Present construct blocks after the screening and demographic sections; randomize item order within each block.</w:t>
+        <w:t>All construct items use a 5-point Likert scale: 1 = strongly disagree, 2 = disagree, 3 = neutral, 4 = agree, 5 = strongly agree. The brand named in S5 is piped into every item in place of “this brand.” Present construct blocks after the screening and demographic sections; randomize item order within each block.</w:t>
       </w:r>
     </w:p>
     <w:p>
@@ -928,7 +928,7 @@
           <w:b/>
           <w:sz w:val="24"/>
         </w:rPr>
-        <w:t>Section C. Construct Items (reflective; 7-point Likert)</w:t>
+        <w:t>Section C. Construct Items (reflective; 5-point Likert)</w:t>
       </w:r>
     </w:p>
     <w:p>
@@ -4067,14 +4067,15 @@
             <w:tcW w:type="dxa" w:w="1728"/>
           </w:tcPr>
           <w:p>
-            <w:r/>
+            <w:r>
+              <w:t>Integer 1–5</w:t>
+            </w:r>
             <w:r>
               <w:rPr>
                 <w:rFonts w:ascii="Times New Roman" w:hAnsi="Times New Roman"/>
                 <w:b w:val="0"/>
                 <w:sz w:val="18"/>
               </w:rPr>
-              <w:t>Integer 1–7</w:t>
             </w:r>
           </w:p>
         </w:tc>
@@ -4117,14 +4118,15 @@
             <w:tcW w:type="dxa" w:w="1728"/>
           </w:tcPr>
           <w:p>
-            <w:r/>
+            <w:r>
+              <w:t>Integer 1–5</w:t>
+            </w:r>
             <w:r>
               <w:rPr>
                 <w:rFonts w:ascii="Times New Roman" w:hAnsi="Times New Roman"/>
                 <w:b w:val="0"/>
                 <w:sz w:val="18"/>
               </w:rPr>
-              <w:t>Integer 1–7</w:t>
             </w:r>
           </w:p>
         </w:tc>
@@ -4167,14 +4169,15 @@
             <w:tcW w:type="dxa" w:w="1728"/>
           </w:tcPr>
           <w:p>
-            <w:r/>
+            <w:r>
+              <w:t>Integer 1–5</w:t>
+            </w:r>
             <w:r>
               <w:rPr>
                 <w:rFonts w:ascii="Times New Roman" w:hAnsi="Times New Roman"/>
                 <w:b w:val="0"/>
                 <w:sz w:val="18"/>
               </w:rPr>
-              <w:t>Integer 1–7</w:t>
             </w:r>
           </w:p>
         </w:tc>
@@ -4217,14 +4220,15 @@
             <w:tcW w:type="dxa" w:w="1728"/>
           </w:tcPr>
           <w:p>
-            <w:r/>
+            <w:r>
+              <w:t>Integer 1–5</w:t>
+            </w:r>
             <w:r>
               <w:rPr>
                 <w:rFonts w:ascii="Times New Roman" w:hAnsi="Times New Roman"/>
                 <w:b w:val="0"/>
                 <w:sz w:val="18"/>
               </w:rPr>
-              <w:t>Integer 1–7</w:t>
             </w:r>
           </w:p>
         </w:tc>
@@ -4267,14 +4271,15 @@
             <w:tcW w:type="dxa" w:w="1728"/>
           </w:tcPr>
           <w:p>
-            <w:r/>
+            <w:r>
+              <w:t>Integer 1–5</w:t>
+            </w:r>
             <w:r>
               <w:rPr>
                 <w:rFonts w:ascii="Times New Roman" w:hAnsi="Times New Roman"/>
                 <w:b w:val="0"/>
                 <w:sz w:val="18"/>
               </w:rPr>
-              <w:t>Integer 1–7</w:t>
             </w:r>
           </w:p>
         </w:tc>
@@ -4404,7 +4409,7 @@
           <w:rFonts w:ascii="Times New Roman" w:hAnsi="Times New Roman"/>
           <w:sz w:val="22"/>
         </w:rPr>
-        <w:t>Confirm all items are 1–7 with no out-of-range or missing values.</w:t>
+        <w:t>Confirm all items are 1–5 with no out-of-range or missing values.</w:t>
       </w:r>
     </w:p>
     <w:p>

</xml_diff>